<commit_message>
docs: add RAG ablation study results
</commit_message>
<xml_diff>
--- a/docs/Veri-RAG_Evaluation_Summary.docx
+++ b/docs/Veri-RAG_Evaluation_Summary.docx
@@ -1655,12 +1655,8 @@
             <w:r>
               <w:rPr>
                 <w:rFonts w:ascii="Calibri" w:hAnsi="Calibri"/>
-                <w:b w:val="0"/>
-                <w:i w:val="0"/>
-                <w:color w:val="172B3A"/>
-                <w:sz w:val="19"/>
               </w:rPr>
-              <w:t>Vector-score ordering; LLM reranker added after this run</w:t>
+              <w:t>Vector-score ordering; reranker evaluated separately in the sensitivity study</w:t>
             </w:r>
           </w:p>
         </w:tc>
@@ -2933,22 +2929,9 @@
             <w:r>
               <w:rPr>
                 <w:rFonts w:ascii="Calibri" w:hAnsi="Calibri"/>
-                <w:b/>
-                <w:i w:val="0"/>
-                <w:color w:val="7A5A00"/>
-                <w:sz w:val="22"/>
+                <w:sz w:val="20"/>
               </w:rPr>
-              <w:t xml:space="preserve">Threshold statement  </w:t>
-            </w:r>
-            <w:r>
-              <w:rPr>
-                <w:rFonts w:ascii="Calibri" w:hAnsi="Calibri"/>
-                <w:b w:val="0"/>
-                <w:i w:val="0"/>
-                <w:color w:val="172B3A"/>
-                <w:sz w:val="22"/>
-              </w:rPr>
-              <w:t>The required metrics are satisfied by this baseline run. Cost per 1,000 calls and the top_k / reranker / temperature sensitivity study are separate pending deliverables and are not inferred from answer length.</w:t>
+              <w:t>Threshold statement  The baseline satisfies every stated latency and quality threshold. A controlled six-run sensitivity study now covers Top-K, reranker on/off, and three temperature settings. Cost per 1,000 calls remains pending until provider token usage is captured.</w:t>
             </w:r>
           </w:p>
         </w:tc>
@@ -3817,17 +3800,1673 @@
     <w:p>
       <w:pPr>
         <w:pStyle w:val="Heading1"/>
+        <w:pageBreakBefore w:val="0"/>
+      </w:pPr>
+      <w:r>
+        <w:t>8. Ablation and Sensitivity Study</w:t>
+      </w:r>
+    </w:p>
+    <w:p>
+      <w:r>
+        <w:t>Six controlled live-API runs used the same 47-case dataset, models, similarity threshold, and disabled answer cache. Only Top-K, reranker state, or temperature changed. The headline baseline earlier in this report is retained as the acceptance run; E0 below is the fresh control run executed with the ablations.</w:t>
+      </w:r>
+    </w:p>
+    <w:tbl>
+      <w:tblPr>
+        <w:tblW w:type="dxa" w:w="9360"/>
+        <w:tblLayout w:type="fixed"/>
+        <w:tblLook w:firstColumn="1" w:firstRow="1" w:lastColumn="0" w:lastRow="0" w:noHBand="0" w:noVBand="1" w:val="04A0"/>
+        <w:jc w:val="left"/>
+        <w:tblInd w:w="120" w:type="dxa"/>
+        <w:tblBorders>
+          <w:top w:val="single" w:sz="4" w:space="0" w:color="CBD3DA"/>
+          <w:left w:val="single" w:sz="4" w:space="0" w:color="CBD3DA"/>
+          <w:bottom w:val="single" w:sz="4" w:space="0" w:color="CBD3DA"/>
+          <w:right w:val="single" w:sz="4" w:space="0" w:color="CBD3DA"/>
+          <w:insideH w:val="single" w:sz="4" w:space="0" w:color="CBD3DA"/>
+          <w:insideV w:val="single" w:sz="4" w:space="0" w:color="CBD3DA"/>
+        </w:tblBorders>
+      </w:tblPr>
+      <w:tblGrid>
+        <w:gridCol w:w="1050"/>
+        <w:gridCol w:w="2050"/>
+        <w:gridCol w:w="800"/>
+        <w:gridCol w:w="800"/>
+        <w:gridCol w:w="950"/>
+        <w:gridCol w:w="1050"/>
+        <w:gridCol w:w="1050"/>
+        <w:gridCol w:w="1610"/>
+      </w:tblGrid>
+      <w:tr>
+        <w:trPr>
+          <w:tblHeader w:val="true"/>
+        </w:trPr>
+        <w:tc>
+          <w:tcPr>
+            <w:tcW w:type="dxa" w:w="1050"/>
+            <w:tcMar>
+              <w:top w:w="75" w:type="dxa"/>
+              <w:start w:w="85" w:type="dxa"/>
+              <w:bottom w:w="75" w:type="dxa"/>
+              <w:end w:w="85" w:type="dxa"/>
+            </w:tcMar>
+            <w:vAlign w:val="center"/>
+            <w:shd w:fill="F2F4F7"/>
+          </w:tcPr>
+          <w:p>
+            <w:pPr>
+              <w:spacing w:before="0" w:after="0" w:line="240" w:lineRule="auto"/>
+              <w:jc w:val="left"/>
+            </w:pPr>
+            <w:r>
+              <w:rPr>
+                <w:rFonts w:ascii="Calibri" w:hAnsi="Calibri"/>
+                <w:b/>
+                <w:sz w:val="15"/>
+              </w:rPr>
+              <w:t>Run</w:t>
+            </w:r>
+          </w:p>
+        </w:tc>
+        <w:tc>
+          <w:tcPr>
+            <w:tcW w:type="dxa" w:w="2050"/>
+            <w:tcMar>
+              <w:top w:w="75" w:type="dxa"/>
+              <w:start w:w="85" w:type="dxa"/>
+              <w:bottom w:w="75" w:type="dxa"/>
+              <w:end w:w="85" w:type="dxa"/>
+            </w:tcMar>
+            <w:vAlign w:val="center"/>
+            <w:shd w:fill="F2F4F7"/>
+          </w:tcPr>
+          <w:p>
+            <w:pPr>
+              <w:spacing w:before="0" w:after="0" w:line="240" w:lineRule="auto"/>
+              <w:jc w:val="left"/>
+            </w:pPr>
+            <w:r>
+              <w:rPr>
+                <w:rFonts w:ascii="Calibri" w:hAnsi="Calibri"/>
+                <w:b/>
+                <w:sz w:val="15"/>
+              </w:rPr>
+              <w:t>Configuration</w:t>
+            </w:r>
+          </w:p>
+        </w:tc>
+        <w:tc>
+          <w:tcPr>
+            <w:tcW w:type="dxa" w:w="800"/>
+            <w:tcMar>
+              <w:top w:w="75" w:type="dxa"/>
+              <w:start w:w="85" w:type="dxa"/>
+              <w:bottom w:w="75" w:type="dxa"/>
+              <w:end w:w="85" w:type="dxa"/>
+            </w:tcMar>
+            <w:vAlign w:val="center"/>
+            <w:shd w:fill="F2F4F7"/>
+          </w:tcPr>
+          <w:p>
+            <w:pPr>
+              <w:spacing w:before="0" w:after="0" w:line="240" w:lineRule="auto"/>
+              <w:jc w:val="center"/>
+            </w:pPr>
+            <w:r>
+              <w:rPr>
+                <w:rFonts w:ascii="Calibri" w:hAnsi="Calibri"/>
+                <w:b/>
+                <w:sz w:val="15"/>
+              </w:rPr>
+              <w:t>P50</w:t>
+            </w:r>
+          </w:p>
+        </w:tc>
+        <w:tc>
+          <w:tcPr>
+            <w:tcW w:type="dxa" w:w="800"/>
+            <w:tcMar>
+              <w:top w:w="75" w:type="dxa"/>
+              <w:start w:w="85" w:type="dxa"/>
+              <w:bottom w:w="75" w:type="dxa"/>
+              <w:end w:w="85" w:type="dxa"/>
+            </w:tcMar>
+            <w:vAlign w:val="center"/>
+            <w:shd w:fill="F2F4F7"/>
+          </w:tcPr>
+          <w:p>
+            <w:pPr>
+              <w:spacing w:before="0" w:after="0" w:line="240" w:lineRule="auto"/>
+              <w:jc w:val="center"/>
+            </w:pPr>
+            <w:r>
+              <w:rPr>
+                <w:rFonts w:ascii="Calibri" w:hAnsi="Calibri"/>
+                <w:b/>
+                <w:sz w:val="15"/>
+              </w:rPr>
+              <w:t>P90</w:t>
+            </w:r>
+          </w:p>
+        </w:tc>
+        <w:tc>
+          <w:tcPr>
+            <w:tcW w:type="dxa" w:w="950"/>
+            <w:tcMar>
+              <w:top w:w="75" w:type="dxa"/>
+              <w:start w:w="85" w:type="dxa"/>
+              <w:bottom w:w="75" w:type="dxa"/>
+              <w:end w:w="85" w:type="dxa"/>
+            </w:tcMar>
+            <w:vAlign w:val="center"/>
+            <w:shd w:fill="F2F4F7"/>
+          </w:tcPr>
+          <w:p>
+            <w:pPr>
+              <w:spacing w:before="0" w:after="0" w:line="240" w:lineRule="auto"/>
+              <w:jc w:val="center"/>
+            </w:pPr>
+            <w:r>
+              <w:rPr>
+                <w:rFonts w:ascii="Calibri" w:hAnsi="Calibri"/>
+                <w:b/>
+                <w:sz w:val="15"/>
+              </w:rPr>
+              <w:t>Accuracy</w:t>
+            </w:r>
+          </w:p>
+        </w:tc>
+        <w:tc>
+          <w:tcPr>
+            <w:tcW w:type="dxa" w:w="1050"/>
+            <w:tcMar>
+              <w:top w:w="75" w:type="dxa"/>
+              <w:start w:w="85" w:type="dxa"/>
+              <w:bottom w:w="75" w:type="dxa"/>
+              <w:end w:w="85" w:type="dxa"/>
+            </w:tcMar>
+            <w:vAlign w:val="center"/>
+            <w:shd w:fill="F2F4F7"/>
+          </w:tcPr>
+          <w:p>
+            <w:pPr>
+              <w:spacing w:before="0" w:after="0" w:line="240" w:lineRule="auto"/>
+              <w:jc w:val="center"/>
+            </w:pPr>
+            <w:r>
+              <w:rPr>
+                <w:rFonts w:ascii="Calibri" w:hAnsi="Calibri"/>
+                <w:b/>
+                <w:sz w:val="15"/>
+              </w:rPr>
+              <w:t>Context</w:t>
+              <w:br/>
+              <w:t>Precision</w:t>
+            </w:r>
+          </w:p>
+        </w:tc>
+        <w:tc>
+          <w:tcPr>
+            <w:tcW w:type="dxa" w:w="1050"/>
+            <w:tcMar>
+              <w:top w:w="75" w:type="dxa"/>
+              <w:start w:w="85" w:type="dxa"/>
+              <w:bottom w:w="75" w:type="dxa"/>
+              <w:end w:w="85" w:type="dxa"/>
+            </w:tcMar>
+            <w:vAlign w:val="center"/>
+            <w:shd w:fill="F2F4F7"/>
+          </w:tcPr>
+          <w:p>
+            <w:pPr>
+              <w:spacing w:before="0" w:after="0" w:line="240" w:lineRule="auto"/>
+              <w:jc w:val="center"/>
+            </w:pPr>
+            <w:r>
+              <w:rPr>
+                <w:rFonts w:ascii="Calibri" w:hAnsi="Calibri"/>
+                <w:b/>
+                <w:sz w:val="15"/>
+              </w:rPr>
+              <w:t>Faithfulness</w:t>
+            </w:r>
+          </w:p>
+        </w:tc>
+        <w:tc>
+          <w:tcPr>
+            <w:tcW w:type="dxa" w:w="1610"/>
+            <w:tcMar>
+              <w:top w:w="75" w:type="dxa"/>
+              <w:start w:w="85" w:type="dxa"/>
+              <w:bottom w:w="75" w:type="dxa"/>
+              <w:end w:w="85" w:type="dxa"/>
+            </w:tcMar>
+            <w:vAlign w:val="center"/>
+            <w:shd w:fill="F2F4F7"/>
+          </w:tcPr>
+          <w:p>
+            <w:pPr>
+              <w:spacing w:before="0" w:after="0" w:line="240" w:lineRule="auto"/>
+              <w:jc w:val="center"/>
+            </w:pPr>
+            <w:r>
+              <w:rPr>
+                <w:rFonts w:ascii="Calibri" w:hAnsi="Calibri"/>
+                <w:b/>
+                <w:sz w:val="15"/>
+              </w:rPr>
+              <w:t>Returned</w:t>
+              <w:br/>
+              <w:t>chunks</w:t>
+            </w:r>
+          </w:p>
+        </w:tc>
+      </w:tr>
+      <w:tr>
+        <w:tc>
+          <w:tcPr>
+            <w:tcW w:type="dxa" w:w="1050"/>
+            <w:tcMar>
+              <w:top w:w="75" w:type="dxa"/>
+              <w:start w:w="85" w:type="dxa"/>
+              <w:bottom w:w="75" w:type="dxa"/>
+              <w:end w:w="85" w:type="dxa"/>
+            </w:tcMar>
+            <w:vAlign w:val="center"/>
+          </w:tcPr>
+          <w:p>
+            <w:pPr>
+              <w:spacing w:before="0" w:after="0" w:line="240" w:lineRule="auto"/>
+              <w:jc w:val="left"/>
+            </w:pPr>
+            <w:r>
+              <w:rPr>
+                <w:rFonts w:ascii="Calibri" w:hAnsi="Calibri"/>
+                <w:b w:val="0"/>
+                <w:sz w:val="14"/>
+              </w:rPr>
+              <w:t>E0 baseline</w:t>
+            </w:r>
+          </w:p>
+        </w:tc>
+        <w:tc>
+          <w:tcPr>
+            <w:tcW w:type="dxa" w:w="2050"/>
+            <w:tcMar>
+              <w:top w:w="75" w:type="dxa"/>
+              <w:start w:w="85" w:type="dxa"/>
+              <w:bottom w:w="75" w:type="dxa"/>
+              <w:end w:w="85" w:type="dxa"/>
+            </w:tcMar>
+            <w:vAlign w:val="center"/>
+          </w:tcPr>
+          <w:p>
+            <w:pPr>
+              <w:spacing w:before="0" w:after="0" w:line="240" w:lineRule="auto"/>
+              <w:jc w:val="left"/>
+            </w:pPr>
+            <w:r>
+              <w:rPr>
+                <w:rFonts w:ascii="Calibri" w:hAnsi="Calibri"/>
+                <w:b w:val="0"/>
+                <w:sz w:val="14"/>
+              </w:rPr>
+              <w:t>K2 / Off / T0.2</w:t>
+            </w:r>
+          </w:p>
+        </w:tc>
+        <w:tc>
+          <w:tcPr>
+            <w:tcW w:type="dxa" w:w="800"/>
+            <w:tcMar>
+              <w:top w:w="75" w:type="dxa"/>
+              <w:start w:w="85" w:type="dxa"/>
+              <w:bottom w:w="75" w:type="dxa"/>
+              <w:end w:w="85" w:type="dxa"/>
+            </w:tcMar>
+            <w:vAlign w:val="center"/>
+          </w:tcPr>
+          <w:p>
+            <w:pPr>
+              <w:spacing w:before="0" w:after="0" w:line="240" w:lineRule="auto"/>
+              <w:jc w:val="center"/>
+            </w:pPr>
+            <w:r>
+              <w:rPr>
+                <w:rFonts w:ascii="Calibri" w:hAnsi="Calibri"/>
+                <w:b w:val="0"/>
+                <w:sz w:val="14"/>
+              </w:rPr>
+              <w:t>779 ms</w:t>
+            </w:r>
+          </w:p>
+        </w:tc>
+        <w:tc>
+          <w:tcPr>
+            <w:tcW w:type="dxa" w:w="800"/>
+            <w:tcMar>
+              <w:top w:w="75" w:type="dxa"/>
+              <w:start w:w="85" w:type="dxa"/>
+              <w:bottom w:w="75" w:type="dxa"/>
+              <w:end w:w="85" w:type="dxa"/>
+            </w:tcMar>
+            <w:vAlign w:val="center"/>
+          </w:tcPr>
+          <w:p>
+            <w:pPr>
+              <w:spacing w:before="0" w:after="0" w:line="240" w:lineRule="auto"/>
+              <w:jc w:val="center"/>
+            </w:pPr>
+            <w:r>
+              <w:rPr>
+                <w:rFonts w:ascii="Calibri" w:hAnsi="Calibri"/>
+                <w:b w:val="0"/>
+                <w:sz w:val="14"/>
+              </w:rPr>
+              <w:t>1,479 ms</w:t>
+            </w:r>
+          </w:p>
+        </w:tc>
+        <w:tc>
+          <w:tcPr>
+            <w:tcW w:type="dxa" w:w="950"/>
+            <w:tcMar>
+              <w:top w:w="75" w:type="dxa"/>
+              <w:start w:w="85" w:type="dxa"/>
+              <w:bottom w:w="75" w:type="dxa"/>
+              <w:end w:w="85" w:type="dxa"/>
+            </w:tcMar>
+            <w:vAlign w:val="center"/>
+          </w:tcPr>
+          <w:p>
+            <w:pPr>
+              <w:spacing w:before="0" w:after="0" w:line="240" w:lineRule="auto"/>
+              <w:jc w:val="center"/>
+            </w:pPr>
+            <w:r>
+              <w:rPr>
+                <w:rFonts w:ascii="Calibri" w:hAnsi="Calibri"/>
+                <w:b w:val="0"/>
+                <w:sz w:val="14"/>
+              </w:rPr>
+              <w:t>90.2%</w:t>
+            </w:r>
+          </w:p>
+        </w:tc>
+        <w:tc>
+          <w:tcPr>
+            <w:tcW w:type="dxa" w:w="1050"/>
+            <w:tcMar>
+              <w:top w:w="75" w:type="dxa"/>
+              <w:start w:w="85" w:type="dxa"/>
+              <w:bottom w:w="75" w:type="dxa"/>
+              <w:end w:w="85" w:type="dxa"/>
+            </w:tcMar>
+            <w:vAlign w:val="center"/>
+          </w:tcPr>
+          <w:p>
+            <w:pPr>
+              <w:spacing w:before="0" w:after="0" w:line="240" w:lineRule="auto"/>
+              <w:jc w:val="center"/>
+            </w:pPr>
+            <w:r>
+              <w:rPr>
+                <w:rFonts w:ascii="Calibri" w:hAnsi="Calibri"/>
+                <w:b w:val="0"/>
+                <w:sz w:val="14"/>
+              </w:rPr>
+              <w:t>0.927</w:t>
+            </w:r>
+          </w:p>
+        </w:tc>
+        <w:tc>
+          <w:tcPr>
+            <w:tcW w:type="dxa" w:w="1050"/>
+            <w:tcMar>
+              <w:top w:w="75" w:type="dxa"/>
+              <w:start w:w="85" w:type="dxa"/>
+              <w:bottom w:w="75" w:type="dxa"/>
+              <w:end w:w="85" w:type="dxa"/>
+            </w:tcMar>
+            <w:vAlign w:val="center"/>
+          </w:tcPr>
+          <w:p>
+            <w:pPr>
+              <w:spacing w:before="0" w:after="0" w:line="240" w:lineRule="auto"/>
+              <w:jc w:val="center"/>
+            </w:pPr>
+            <w:r>
+              <w:rPr>
+                <w:rFonts w:ascii="Calibri" w:hAnsi="Calibri"/>
+                <w:b w:val="0"/>
+                <w:sz w:val="14"/>
+              </w:rPr>
+              <w:t>0.984</w:t>
+            </w:r>
+          </w:p>
+        </w:tc>
+        <w:tc>
+          <w:tcPr>
+            <w:tcW w:type="dxa" w:w="1610"/>
+            <w:tcMar>
+              <w:top w:w="75" w:type="dxa"/>
+              <w:start w:w="85" w:type="dxa"/>
+              <w:bottom w:w="75" w:type="dxa"/>
+              <w:end w:w="85" w:type="dxa"/>
+            </w:tcMar>
+            <w:vAlign w:val="center"/>
+          </w:tcPr>
+          <w:p>
+            <w:pPr>
+              <w:spacing w:before="0" w:after="0" w:line="240" w:lineRule="auto"/>
+              <w:jc w:val="center"/>
+            </w:pPr>
+            <w:r>
+              <w:rPr>
+                <w:rFonts w:ascii="Calibri" w:hAnsi="Calibri"/>
+                <w:b w:val="0"/>
+                <w:sz w:val="14"/>
+              </w:rPr>
+              <w:t>75</w:t>
+            </w:r>
+          </w:p>
+        </w:tc>
+      </w:tr>
+      <w:tr>
+        <w:tc>
+          <w:tcPr>
+            <w:tcW w:type="dxa" w:w="1050"/>
+            <w:tcMar>
+              <w:top w:w="75" w:type="dxa"/>
+              <w:start w:w="85" w:type="dxa"/>
+              <w:bottom w:w="75" w:type="dxa"/>
+              <w:end w:w="85" w:type="dxa"/>
+            </w:tcMar>
+            <w:vAlign w:val="center"/>
+            <w:shd w:fill="FAFBFC"/>
+          </w:tcPr>
+          <w:p>
+            <w:pPr>
+              <w:spacing w:before="0" w:after="0" w:line="240" w:lineRule="auto"/>
+              <w:jc w:val="left"/>
+            </w:pPr>
+            <w:r>
+              <w:rPr>
+                <w:rFonts w:ascii="Calibri" w:hAnsi="Calibri"/>
+                <w:b w:val="0"/>
+                <w:sz w:val="14"/>
+              </w:rPr>
+              <w:t>E1 narrow</w:t>
+            </w:r>
+          </w:p>
+        </w:tc>
+        <w:tc>
+          <w:tcPr>
+            <w:tcW w:type="dxa" w:w="2050"/>
+            <w:tcMar>
+              <w:top w:w="75" w:type="dxa"/>
+              <w:start w:w="85" w:type="dxa"/>
+              <w:bottom w:w="75" w:type="dxa"/>
+              <w:end w:w="85" w:type="dxa"/>
+            </w:tcMar>
+            <w:vAlign w:val="center"/>
+            <w:shd w:fill="FAFBFC"/>
+          </w:tcPr>
+          <w:p>
+            <w:pPr>
+              <w:spacing w:before="0" w:after="0" w:line="240" w:lineRule="auto"/>
+              <w:jc w:val="left"/>
+            </w:pPr>
+            <w:r>
+              <w:rPr>
+                <w:rFonts w:ascii="Calibri" w:hAnsi="Calibri"/>
+                <w:b w:val="0"/>
+                <w:sz w:val="14"/>
+              </w:rPr>
+              <w:t>K1 / Off / T0.2</w:t>
+            </w:r>
+          </w:p>
+        </w:tc>
+        <w:tc>
+          <w:tcPr>
+            <w:tcW w:type="dxa" w:w="800"/>
+            <w:tcMar>
+              <w:top w:w="75" w:type="dxa"/>
+              <w:start w:w="85" w:type="dxa"/>
+              <w:bottom w:w="75" w:type="dxa"/>
+              <w:end w:w="85" w:type="dxa"/>
+            </w:tcMar>
+            <w:vAlign w:val="center"/>
+            <w:shd w:fill="FAFBFC"/>
+          </w:tcPr>
+          <w:p>
+            <w:pPr>
+              <w:spacing w:before="0" w:after="0" w:line="240" w:lineRule="auto"/>
+              <w:jc w:val="center"/>
+            </w:pPr>
+            <w:r>
+              <w:rPr>
+                <w:rFonts w:ascii="Calibri" w:hAnsi="Calibri"/>
+                <w:b w:val="0"/>
+                <w:sz w:val="14"/>
+              </w:rPr>
+              <w:t>785 ms</w:t>
+            </w:r>
+          </w:p>
+        </w:tc>
+        <w:tc>
+          <w:tcPr>
+            <w:tcW w:type="dxa" w:w="800"/>
+            <w:tcMar>
+              <w:top w:w="75" w:type="dxa"/>
+              <w:start w:w="85" w:type="dxa"/>
+              <w:bottom w:w="75" w:type="dxa"/>
+              <w:end w:w="85" w:type="dxa"/>
+            </w:tcMar>
+            <w:vAlign w:val="center"/>
+            <w:shd w:fill="FAFBFC"/>
+          </w:tcPr>
+          <w:p>
+            <w:pPr>
+              <w:spacing w:before="0" w:after="0" w:line="240" w:lineRule="auto"/>
+              <w:jc w:val="center"/>
+            </w:pPr>
+            <w:r>
+              <w:rPr>
+                <w:rFonts w:ascii="Calibri" w:hAnsi="Calibri"/>
+                <w:b w:val="0"/>
+                <w:sz w:val="14"/>
+              </w:rPr>
+              <w:t>1,726 ms</w:t>
+            </w:r>
+          </w:p>
+        </w:tc>
+        <w:tc>
+          <w:tcPr>
+            <w:tcW w:type="dxa" w:w="950"/>
+            <w:tcMar>
+              <w:top w:w="75" w:type="dxa"/>
+              <w:start w:w="85" w:type="dxa"/>
+              <w:bottom w:w="75" w:type="dxa"/>
+              <w:end w:w="85" w:type="dxa"/>
+            </w:tcMar>
+            <w:vAlign w:val="center"/>
+            <w:shd w:fill="FAFBFC"/>
+          </w:tcPr>
+          <w:p>
+            <w:pPr>
+              <w:spacing w:before="0" w:after="0" w:line="240" w:lineRule="auto"/>
+              <w:jc w:val="center"/>
+            </w:pPr>
+            <w:r>
+              <w:rPr>
+                <w:rFonts w:ascii="Calibri" w:hAnsi="Calibri"/>
+                <w:b w:val="0"/>
+                <w:sz w:val="14"/>
+              </w:rPr>
+              <w:t>85.4%</w:t>
+            </w:r>
+          </w:p>
+        </w:tc>
+        <w:tc>
+          <w:tcPr>
+            <w:tcW w:type="dxa" w:w="1050"/>
+            <w:tcMar>
+              <w:top w:w="75" w:type="dxa"/>
+              <w:start w:w="85" w:type="dxa"/>
+              <w:bottom w:w="75" w:type="dxa"/>
+              <w:end w:w="85" w:type="dxa"/>
+            </w:tcMar>
+            <w:vAlign w:val="center"/>
+            <w:shd w:fill="FAFBFC"/>
+          </w:tcPr>
+          <w:p>
+            <w:pPr>
+              <w:spacing w:before="0" w:after="0" w:line="240" w:lineRule="auto"/>
+              <w:jc w:val="center"/>
+            </w:pPr>
+            <w:r>
+              <w:rPr>
+                <w:rFonts w:ascii="Calibri" w:hAnsi="Calibri"/>
+                <w:b w:val="0"/>
+                <w:sz w:val="14"/>
+              </w:rPr>
+              <w:t>0.875</w:t>
+            </w:r>
+          </w:p>
+        </w:tc>
+        <w:tc>
+          <w:tcPr>
+            <w:tcW w:type="dxa" w:w="1050"/>
+            <w:tcMar>
+              <w:top w:w="75" w:type="dxa"/>
+              <w:start w:w="85" w:type="dxa"/>
+              <w:bottom w:w="75" w:type="dxa"/>
+              <w:end w:w="85" w:type="dxa"/>
+            </w:tcMar>
+            <w:vAlign w:val="center"/>
+            <w:shd w:fill="FAFBFC"/>
+          </w:tcPr>
+          <w:p>
+            <w:pPr>
+              <w:spacing w:before="0" w:after="0" w:line="240" w:lineRule="auto"/>
+              <w:jc w:val="center"/>
+            </w:pPr>
+            <w:r>
+              <w:rPr>
+                <w:rFonts w:ascii="Calibri" w:hAnsi="Calibri"/>
+                <w:b w:val="0"/>
+                <w:sz w:val="14"/>
+              </w:rPr>
+              <w:t>0.894</w:t>
+            </w:r>
+          </w:p>
+        </w:tc>
+        <w:tc>
+          <w:tcPr>
+            <w:tcW w:type="dxa" w:w="1610"/>
+            <w:tcMar>
+              <w:top w:w="75" w:type="dxa"/>
+              <w:start w:w="85" w:type="dxa"/>
+              <w:bottom w:w="75" w:type="dxa"/>
+              <w:end w:w="85" w:type="dxa"/>
+            </w:tcMar>
+            <w:vAlign w:val="center"/>
+            <w:shd w:fill="FAFBFC"/>
+          </w:tcPr>
+          <w:p>
+            <w:pPr>
+              <w:spacing w:before="0" w:after="0" w:line="240" w:lineRule="auto"/>
+              <w:jc w:val="center"/>
+            </w:pPr>
+            <w:r>
+              <w:rPr>
+                <w:rFonts w:ascii="Calibri" w:hAnsi="Calibri"/>
+                <w:b w:val="0"/>
+                <w:sz w:val="14"/>
+              </w:rPr>
+              <w:t>40</w:t>
+            </w:r>
+          </w:p>
+        </w:tc>
+      </w:tr>
+      <w:tr>
+        <w:tc>
+          <w:tcPr>
+            <w:tcW w:type="dxa" w:w="1050"/>
+            <w:tcMar>
+              <w:top w:w="75" w:type="dxa"/>
+              <w:start w:w="85" w:type="dxa"/>
+              <w:bottom w:w="75" w:type="dxa"/>
+              <w:end w:w="85" w:type="dxa"/>
+            </w:tcMar>
+            <w:vAlign w:val="center"/>
+          </w:tcPr>
+          <w:p>
+            <w:pPr>
+              <w:spacing w:before="0" w:after="0" w:line="240" w:lineRule="auto"/>
+              <w:jc w:val="left"/>
+            </w:pPr>
+            <w:r>
+              <w:rPr>
+                <w:rFonts w:ascii="Calibri" w:hAnsi="Calibri"/>
+                <w:b w:val="0"/>
+                <w:sz w:val="14"/>
+              </w:rPr>
+              <w:t>E2 broad</w:t>
+            </w:r>
+          </w:p>
+        </w:tc>
+        <w:tc>
+          <w:tcPr>
+            <w:tcW w:type="dxa" w:w="2050"/>
+            <w:tcMar>
+              <w:top w:w="75" w:type="dxa"/>
+              <w:start w:w="85" w:type="dxa"/>
+              <w:bottom w:w="75" w:type="dxa"/>
+              <w:end w:w="85" w:type="dxa"/>
+            </w:tcMar>
+            <w:vAlign w:val="center"/>
+          </w:tcPr>
+          <w:p>
+            <w:pPr>
+              <w:spacing w:before="0" w:after="0" w:line="240" w:lineRule="auto"/>
+              <w:jc w:val="left"/>
+            </w:pPr>
+            <w:r>
+              <w:rPr>
+                <w:rFonts w:ascii="Calibri" w:hAnsi="Calibri"/>
+                <w:b w:val="0"/>
+                <w:sz w:val="14"/>
+              </w:rPr>
+              <w:t>K4 / Off / T0.2</w:t>
+            </w:r>
+          </w:p>
+        </w:tc>
+        <w:tc>
+          <w:tcPr>
+            <w:tcW w:type="dxa" w:w="800"/>
+            <w:tcMar>
+              <w:top w:w="75" w:type="dxa"/>
+              <w:start w:w="85" w:type="dxa"/>
+              <w:bottom w:w="75" w:type="dxa"/>
+              <w:end w:w="85" w:type="dxa"/>
+            </w:tcMar>
+            <w:vAlign w:val="center"/>
+          </w:tcPr>
+          <w:p>
+            <w:pPr>
+              <w:spacing w:before="0" w:after="0" w:line="240" w:lineRule="auto"/>
+              <w:jc w:val="center"/>
+            </w:pPr>
+            <w:r>
+              <w:rPr>
+                <w:rFonts w:ascii="Calibri" w:hAnsi="Calibri"/>
+                <w:b w:val="0"/>
+                <w:sz w:val="14"/>
+              </w:rPr>
+              <w:t>813 ms</w:t>
+            </w:r>
+          </w:p>
+        </w:tc>
+        <w:tc>
+          <w:tcPr>
+            <w:tcW w:type="dxa" w:w="800"/>
+            <w:tcMar>
+              <w:top w:w="75" w:type="dxa"/>
+              <w:start w:w="85" w:type="dxa"/>
+              <w:bottom w:w="75" w:type="dxa"/>
+              <w:end w:w="85" w:type="dxa"/>
+            </w:tcMar>
+            <w:vAlign w:val="center"/>
+          </w:tcPr>
+          <w:p>
+            <w:pPr>
+              <w:spacing w:before="0" w:after="0" w:line="240" w:lineRule="auto"/>
+              <w:jc w:val="center"/>
+            </w:pPr>
+            <w:r>
+              <w:rPr>
+                <w:rFonts w:ascii="Calibri" w:hAnsi="Calibri"/>
+                <w:b w:val="0"/>
+                <w:sz w:val="14"/>
+              </w:rPr>
+              <w:t>1,610 ms</w:t>
+            </w:r>
+          </w:p>
+        </w:tc>
+        <w:tc>
+          <w:tcPr>
+            <w:tcW w:type="dxa" w:w="950"/>
+            <w:tcMar>
+              <w:top w:w="75" w:type="dxa"/>
+              <w:start w:w="85" w:type="dxa"/>
+              <w:bottom w:w="75" w:type="dxa"/>
+              <w:end w:w="85" w:type="dxa"/>
+            </w:tcMar>
+            <w:vAlign w:val="center"/>
+          </w:tcPr>
+          <w:p>
+            <w:pPr>
+              <w:spacing w:before="0" w:after="0" w:line="240" w:lineRule="auto"/>
+              <w:jc w:val="center"/>
+            </w:pPr>
+            <w:r>
+              <w:rPr>
+                <w:rFonts w:ascii="Calibri" w:hAnsi="Calibri"/>
+                <w:b w:val="0"/>
+                <w:sz w:val="14"/>
+              </w:rPr>
+              <w:t>92.7%</w:t>
+            </w:r>
+          </w:p>
+        </w:tc>
+        <w:tc>
+          <w:tcPr>
+            <w:tcW w:type="dxa" w:w="1050"/>
+            <w:tcMar>
+              <w:top w:w="75" w:type="dxa"/>
+              <w:start w:w="85" w:type="dxa"/>
+              <w:bottom w:w="75" w:type="dxa"/>
+              <w:end w:w="85" w:type="dxa"/>
+            </w:tcMar>
+            <w:vAlign w:val="center"/>
+          </w:tcPr>
+          <w:p>
+            <w:pPr>
+              <w:spacing w:before="0" w:after="0" w:line="240" w:lineRule="auto"/>
+              <w:jc w:val="center"/>
+            </w:pPr>
+            <w:r>
+              <w:rPr>
+                <w:rFonts w:ascii="Calibri" w:hAnsi="Calibri"/>
+                <w:b w:val="0"/>
+                <w:sz w:val="14"/>
+              </w:rPr>
+              <w:t>0.913</w:t>
+            </w:r>
+          </w:p>
+        </w:tc>
+        <w:tc>
+          <w:tcPr>
+            <w:tcW w:type="dxa" w:w="1050"/>
+            <w:tcMar>
+              <w:top w:w="75" w:type="dxa"/>
+              <w:start w:w="85" w:type="dxa"/>
+              <w:bottom w:w="75" w:type="dxa"/>
+              <w:end w:w="85" w:type="dxa"/>
+            </w:tcMar>
+            <w:vAlign w:val="center"/>
+          </w:tcPr>
+          <w:p>
+            <w:pPr>
+              <w:spacing w:before="0" w:after="0" w:line="240" w:lineRule="auto"/>
+              <w:jc w:val="center"/>
+            </w:pPr>
+            <w:r>
+              <w:rPr>
+                <w:rFonts w:ascii="Calibri" w:hAnsi="Calibri"/>
+                <w:b w:val="0"/>
+                <w:sz w:val="14"/>
+              </w:rPr>
+              <w:t>0.988</w:t>
+            </w:r>
+          </w:p>
+        </w:tc>
+        <w:tc>
+          <w:tcPr>
+            <w:tcW w:type="dxa" w:w="1610"/>
+            <w:tcMar>
+              <w:top w:w="75" w:type="dxa"/>
+              <w:start w:w="85" w:type="dxa"/>
+              <w:bottom w:w="75" w:type="dxa"/>
+              <w:end w:w="85" w:type="dxa"/>
+            </w:tcMar>
+            <w:vAlign w:val="center"/>
+          </w:tcPr>
+          <w:p>
+            <w:pPr>
+              <w:spacing w:before="0" w:after="0" w:line="240" w:lineRule="auto"/>
+              <w:jc w:val="center"/>
+            </w:pPr>
+            <w:r>
+              <w:rPr>
+                <w:rFonts w:ascii="Calibri" w:hAnsi="Calibri"/>
+                <w:b w:val="0"/>
+                <w:sz w:val="14"/>
+              </w:rPr>
+              <w:t>123</w:t>
+            </w:r>
+          </w:p>
+        </w:tc>
+      </w:tr>
+      <w:tr>
+        <w:tc>
+          <w:tcPr>
+            <w:tcW w:type="dxa" w:w="1050"/>
+            <w:tcMar>
+              <w:top w:w="75" w:type="dxa"/>
+              <w:start w:w="85" w:type="dxa"/>
+              <w:bottom w:w="75" w:type="dxa"/>
+              <w:end w:w="85" w:type="dxa"/>
+            </w:tcMar>
+            <w:vAlign w:val="center"/>
+            <w:shd w:fill="FAFBFC"/>
+          </w:tcPr>
+          <w:p>
+            <w:pPr>
+              <w:spacing w:before="0" w:after="0" w:line="240" w:lineRule="auto"/>
+              <w:jc w:val="left"/>
+            </w:pPr>
+            <w:r>
+              <w:rPr>
+                <w:rFonts w:ascii="Calibri" w:hAnsi="Calibri"/>
+                <w:b w:val="0"/>
+                <w:sz w:val="14"/>
+              </w:rPr>
+              <w:t>E3 reranker</w:t>
+            </w:r>
+          </w:p>
+        </w:tc>
+        <w:tc>
+          <w:tcPr>
+            <w:tcW w:type="dxa" w:w="2050"/>
+            <w:tcMar>
+              <w:top w:w="75" w:type="dxa"/>
+              <w:start w:w="85" w:type="dxa"/>
+              <w:bottom w:w="75" w:type="dxa"/>
+              <w:end w:w="85" w:type="dxa"/>
+            </w:tcMar>
+            <w:vAlign w:val="center"/>
+            <w:shd w:fill="FAFBFC"/>
+          </w:tcPr>
+          <w:p>
+            <w:pPr>
+              <w:spacing w:before="0" w:after="0" w:line="240" w:lineRule="auto"/>
+              <w:jc w:val="left"/>
+            </w:pPr>
+            <w:r>
+              <w:rPr>
+                <w:rFonts w:ascii="Calibri" w:hAnsi="Calibri"/>
+                <w:b w:val="0"/>
+                <w:sz w:val="14"/>
+              </w:rPr>
+              <w:t>K2 / On / T0.2</w:t>
+            </w:r>
+          </w:p>
+        </w:tc>
+        <w:tc>
+          <w:tcPr>
+            <w:tcW w:type="dxa" w:w="800"/>
+            <w:tcMar>
+              <w:top w:w="75" w:type="dxa"/>
+              <w:start w:w="85" w:type="dxa"/>
+              <w:bottom w:w="75" w:type="dxa"/>
+              <w:end w:w="85" w:type="dxa"/>
+            </w:tcMar>
+            <w:vAlign w:val="center"/>
+            <w:shd w:fill="FAFBFC"/>
+          </w:tcPr>
+          <w:p>
+            <w:pPr>
+              <w:spacing w:before="0" w:after="0" w:line="240" w:lineRule="auto"/>
+              <w:jc w:val="center"/>
+            </w:pPr>
+            <w:r>
+              <w:rPr>
+                <w:rFonts w:ascii="Calibri" w:hAnsi="Calibri"/>
+                <w:b w:val="0"/>
+                <w:sz w:val="14"/>
+              </w:rPr>
+              <w:t>1,608 ms</w:t>
+            </w:r>
+          </w:p>
+        </w:tc>
+        <w:tc>
+          <w:tcPr>
+            <w:tcW w:type="dxa" w:w="800"/>
+            <w:tcMar>
+              <w:top w:w="75" w:type="dxa"/>
+              <w:start w:w="85" w:type="dxa"/>
+              <w:bottom w:w="75" w:type="dxa"/>
+              <w:end w:w="85" w:type="dxa"/>
+            </w:tcMar>
+            <w:vAlign w:val="center"/>
+            <w:shd w:fill="FAFBFC"/>
+          </w:tcPr>
+          <w:p>
+            <w:pPr>
+              <w:spacing w:before="0" w:after="0" w:line="240" w:lineRule="auto"/>
+              <w:jc w:val="center"/>
+            </w:pPr>
+            <w:r>
+              <w:rPr>
+                <w:rFonts w:ascii="Calibri" w:hAnsi="Calibri"/>
+                <w:b w:val="0"/>
+                <w:sz w:val="14"/>
+              </w:rPr>
+              <w:t>3,860 ms</w:t>
+            </w:r>
+          </w:p>
+        </w:tc>
+        <w:tc>
+          <w:tcPr>
+            <w:tcW w:type="dxa" w:w="950"/>
+            <w:tcMar>
+              <w:top w:w="75" w:type="dxa"/>
+              <w:start w:w="85" w:type="dxa"/>
+              <w:bottom w:w="75" w:type="dxa"/>
+              <w:end w:w="85" w:type="dxa"/>
+            </w:tcMar>
+            <w:vAlign w:val="center"/>
+            <w:shd w:fill="FAFBFC"/>
+          </w:tcPr>
+          <w:p>
+            <w:pPr>
+              <w:spacing w:before="0" w:after="0" w:line="240" w:lineRule="auto"/>
+              <w:jc w:val="center"/>
+            </w:pPr>
+            <w:r>
+              <w:rPr>
+                <w:rFonts w:ascii="Calibri" w:hAnsi="Calibri"/>
+                <w:b w:val="0"/>
+                <w:sz w:val="14"/>
+              </w:rPr>
+              <w:t>90.2%</w:t>
+            </w:r>
+          </w:p>
+        </w:tc>
+        <w:tc>
+          <w:tcPr>
+            <w:tcW w:type="dxa" w:w="1050"/>
+            <w:tcMar>
+              <w:top w:w="75" w:type="dxa"/>
+              <w:start w:w="85" w:type="dxa"/>
+              <w:bottom w:w="75" w:type="dxa"/>
+              <w:end w:w="85" w:type="dxa"/>
+            </w:tcMar>
+            <w:vAlign w:val="center"/>
+            <w:shd w:fill="FAFBFC"/>
+          </w:tcPr>
+          <w:p>
+            <w:pPr>
+              <w:spacing w:before="0" w:after="0" w:line="240" w:lineRule="auto"/>
+              <w:jc w:val="center"/>
+            </w:pPr>
+            <w:r>
+              <w:rPr>
+                <w:rFonts w:ascii="Calibri" w:hAnsi="Calibri"/>
+                <w:b w:val="0"/>
+                <w:sz w:val="14"/>
+              </w:rPr>
+              <w:t>0.963</w:t>
+            </w:r>
+          </w:p>
+        </w:tc>
+        <w:tc>
+          <w:tcPr>
+            <w:tcW w:type="dxa" w:w="1050"/>
+            <w:tcMar>
+              <w:top w:w="75" w:type="dxa"/>
+              <w:start w:w="85" w:type="dxa"/>
+              <w:bottom w:w="75" w:type="dxa"/>
+              <w:end w:w="85" w:type="dxa"/>
+            </w:tcMar>
+            <w:vAlign w:val="center"/>
+            <w:shd w:fill="FAFBFC"/>
+          </w:tcPr>
+          <w:p>
+            <w:pPr>
+              <w:spacing w:before="0" w:after="0" w:line="240" w:lineRule="auto"/>
+              <w:jc w:val="center"/>
+            </w:pPr>
+            <w:r>
+              <w:rPr>
+                <w:rFonts w:ascii="Calibri" w:hAnsi="Calibri"/>
+                <w:b w:val="0"/>
+                <w:sz w:val="14"/>
+              </w:rPr>
+              <w:t>0.978</w:t>
+            </w:r>
+          </w:p>
+        </w:tc>
+        <w:tc>
+          <w:tcPr>
+            <w:tcW w:type="dxa" w:w="1610"/>
+            <w:tcMar>
+              <w:top w:w="75" w:type="dxa"/>
+              <w:start w:w="85" w:type="dxa"/>
+              <w:bottom w:w="75" w:type="dxa"/>
+              <w:end w:w="85" w:type="dxa"/>
+            </w:tcMar>
+            <w:vAlign w:val="center"/>
+            <w:shd w:fill="FAFBFC"/>
+          </w:tcPr>
+          <w:p>
+            <w:pPr>
+              <w:spacing w:before="0" w:after="0" w:line="240" w:lineRule="auto"/>
+              <w:jc w:val="center"/>
+            </w:pPr>
+            <w:r>
+              <w:rPr>
+                <w:rFonts w:ascii="Calibri" w:hAnsi="Calibri"/>
+                <w:b w:val="0"/>
+                <w:sz w:val="14"/>
+              </w:rPr>
+              <w:t>75</w:t>
+            </w:r>
+          </w:p>
+        </w:tc>
+      </w:tr>
+      <w:tr>
+        <w:tc>
+          <w:tcPr>
+            <w:tcW w:type="dxa" w:w="1050"/>
+            <w:tcMar>
+              <w:top w:w="75" w:type="dxa"/>
+              <w:start w:w="85" w:type="dxa"/>
+              <w:bottom w:w="75" w:type="dxa"/>
+              <w:end w:w="85" w:type="dxa"/>
+            </w:tcMar>
+            <w:vAlign w:val="center"/>
+          </w:tcPr>
+          <w:p>
+            <w:pPr>
+              <w:spacing w:before="0" w:after="0" w:line="240" w:lineRule="auto"/>
+              <w:jc w:val="left"/>
+            </w:pPr>
+            <w:r>
+              <w:rPr>
+                <w:rFonts w:ascii="Calibri" w:hAnsi="Calibri"/>
+                <w:b w:val="0"/>
+                <w:sz w:val="14"/>
+              </w:rPr>
+              <w:t>E4 deterministic</w:t>
+            </w:r>
+          </w:p>
+        </w:tc>
+        <w:tc>
+          <w:tcPr>
+            <w:tcW w:type="dxa" w:w="2050"/>
+            <w:tcMar>
+              <w:top w:w="75" w:type="dxa"/>
+              <w:start w:w="85" w:type="dxa"/>
+              <w:bottom w:w="75" w:type="dxa"/>
+              <w:end w:w="85" w:type="dxa"/>
+            </w:tcMar>
+            <w:vAlign w:val="center"/>
+          </w:tcPr>
+          <w:p>
+            <w:pPr>
+              <w:spacing w:before="0" w:after="0" w:line="240" w:lineRule="auto"/>
+              <w:jc w:val="left"/>
+            </w:pPr>
+            <w:r>
+              <w:rPr>
+                <w:rFonts w:ascii="Calibri" w:hAnsi="Calibri"/>
+                <w:b w:val="0"/>
+                <w:sz w:val="14"/>
+              </w:rPr>
+              <w:t>K2 / Off / T0.0</w:t>
+            </w:r>
+          </w:p>
+        </w:tc>
+        <w:tc>
+          <w:tcPr>
+            <w:tcW w:type="dxa" w:w="800"/>
+            <w:tcMar>
+              <w:top w:w="75" w:type="dxa"/>
+              <w:start w:w="85" w:type="dxa"/>
+              <w:bottom w:w="75" w:type="dxa"/>
+              <w:end w:w="85" w:type="dxa"/>
+            </w:tcMar>
+            <w:vAlign w:val="center"/>
+          </w:tcPr>
+          <w:p>
+            <w:pPr>
+              <w:spacing w:before="0" w:after="0" w:line="240" w:lineRule="auto"/>
+              <w:jc w:val="center"/>
+            </w:pPr>
+            <w:r>
+              <w:rPr>
+                <w:rFonts w:ascii="Calibri" w:hAnsi="Calibri"/>
+                <w:b w:val="0"/>
+                <w:sz w:val="14"/>
+              </w:rPr>
+              <w:t>827 ms</w:t>
+            </w:r>
+          </w:p>
+        </w:tc>
+        <w:tc>
+          <w:tcPr>
+            <w:tcW w:type="dxa" w:w="800"/>
+            <w:tcMar>
+              <w:top w:w="75" w:type="dxa"/>
+              <w:start w:w="85" w:type="dxa"/>
+              <w:bottom w:w="75" w:type="dxa"/>
+              <w:end w:w="85" w:type="dxa"/>
+            </w:tcMar>
+            <w:vAlign w:val="center"/>
+          </w:tcPr>
+          <w:p>
+            <w:pPr>
+              <w:spacing w:before="0" w:after="0" w:line="240" w:lineRule="auto"/>
+              <w:jc w:val="center"/>
+            </w:pPr>
+            <w:r>
+              <w:rPr>
+                <w:rFonts w:ascii="Calibri" w:hAnsi="Calibri"/>
+                <w:b w:val="0"/>
+                <w:sz w:val="14"/>
+              </w:rPr>
+              <w:t>1,483 ms</w:t>
+            </w:r>
+          </w:p>
+        </w:tc>
+        <w:tc>
+          <w:tcPr>
+            <w:tcW w:type="dxa" w:w="950"/>
+            <w:tcMar>
+              <w:top w:w="75" w:type="dxa"/>
+              <w:start w:w="85" w:type="dxa"/>
+              <w:bottom w:w="75" w:type="dxa"/>
+              <w:end w:w="85" w:type="dxa"/>
+            </w:tcMar>
+            <w:vAlign w:val="center"/>
+          </w:tcPr>
+          <w:p>
+            <w:pPr>
+              <w:spacing w:before="0" w:after="0" w:line="240" w:lineRule="auto"/>
+              <w:jc w:val="center"/>
+            </w:pPr>
+            <w:r>
+              <w:rPr>
+                <w:rFonts w:ascii="Calibri" w:hAnsi="Calibri"/>
+                <w:b w:val="0"/>
+                <w:sz w:val="14"/>
+              </w:rPr>
+              <w:t>90.2%</w:t>
+            </w:r>
+          </w:p>
+        </w:tc>
+        <w:tc>
+          <w:tcPr>
+            <w:tcW w:type="dxa" w:w="1050"/>
+            <w:tcMar>
+              <w:top w:w="75" w:type="dxa"/>
+              <w:start w:w="85" w:type="dxa"/>
+              <w:bottom w:w="75" w:type="dxa"/>
+              <w:end w:w="85" w:type="dxa"/>
+            </w:tcMar>
+            <w:vAlign w:val="center"/>
+          </w:tcPr>
+          <w:p>
+            <w:pPr>
+              <w:spacing w:before="0" w:after="0" w:line="240" w:lineRule="auto"/>
+              <w:jc w:val="center"/>
+            </w:pPr>
+            <w:r>
+              <w:rPr>
+                <w:rFonts w:ascii="Calibri" w:hAnsi="Calibri"/>
+                <w:b w:val="0"/>
+                <w:sz w:val="14"/>
+              </w:rPr>
+              <w:t>0.927</w:t>
+            </w:r>
+          </w:p>
+        </w:tc>
+        <w:tc>
+          <w:tcPr>
+            <w:tcW w:type="dxa" w:w="1050"/>
+            <w:tcMar>
+              <w:top w:w="75" w:type="dxa"/>
+              <w:start w:w="85" w:type="dxa"/>
+              <w:bottom w:w="75" w:type="dxa"/>
+              <w:end w:w="85" w:type="dxa"/>
+            </w:tcMar>
+            <w:vAlign w:val="center"/>
+          </w:tcPr>
+          <w:p>
+            <w:pPr>
+              <w:spacing w:before="0" w:after="0" w:line="240" w:lineRule="auto"/>
+              <w:jc w:val="center"/>
+            </w:pPr>
+            <w:r>
+              <w:rPr>
+                <w:rFonts w:ascii="Calibri" w:hAnsi="Calibri"/>
+                <w:b w:val="0"/>
+                <w:sz w:val="14"/>
+              </w:rPr>
+              <w:t>1.000</w:t>
+            </w:r>
+          </w:p>
+        </w:tc>
+        <w:tc>
+          <w:tcPr>
+            <w:tcW w:type="dxa" w:w="1610"/>
+            <w:tcMar>
+              <w:top w:w="75" w:type="dxa"/>
+              <w:start w:w="85" w:type="dxa"/>
+              <w:bottom w:w="75" w:type="dxa"/>
+              <w:end w:w="85" w:type="dxa"/>
+            </w:tcMar>
+            <w:vAlign w:val="center"/>
+          </w:tcPr>
+          <w:p>
+            <w:pPr>
+              <w:spacing w:before="0" w:after="0" w:line="240" w:lineRule="auto"/>
+              <w:jc w:val="center"/>
+            </w:pPr>
+            <w:r>
+              <w:rPr>
+                <w:rFonts w:ascii="Calibri" w:hAnsi="Calibri"/>
+                <w:b w:val="0"/>
+                <w:sz w:val="14"/>
+              </w:rPr>
+              <w:t>75</w:t>
+            </w:r>
+          </w:p>
+        </w:tc>
+      </w:tr>
+      <w:tr>
+        <w:tc>
+          <w:tcPr>
+            <w:tcW w:type="dxa" w:w="1050"/>
+            <w:tcMar>
+              <w:top w:w="75" w:type="dxa"/>
+              <w:start w:w="85" w:type="dxa"/>
+              <w:bottom w:w="75" w:type="dxa"/>
+              <w:end w:w="85" w:type="dxa"/>
+            </w:tcMar>
+            <w:vAlign w:val="center"/>
+            <w:shd w:fill="FAFBFC"/>
+          </w:tcPr>
+          <w:p>
+            <w:pPr>
+              <w:spacing w:before="0" w:after="0" w:line="240" w:lineRule="auto"/>
+              <w:jc w:val="left"/>
+            </w:pPr>
+            <w:r>
+              <w:rPr>
+                <w:rFonts w:ascii="Calibri" w:hAnsi="Calibri"/>
+                <w:b w:val="0"/>
+                <w:sz w:val="14"/>
+              </w:rPr>
+              <w:t>E5 higher temp.</w:t>
+            </w:r>
+          </w:p>
+        </w:tc>
+        <w:tc>
+          <w:tcPr>
+            <w:tcW w:type="dxa" w:w="2050"/>
+            <w:tcMar>
+              <w:top w:w="75" w:type="dxa"/>
+              <w:start w:w="85" w:type="dxa"/>
+              <w:bottom w:w="75" w:type="dxa"/>
+              <w:end w:w="85" w:type="dxa"/>
+            </w:tcMar>
+            <w:vAlign w:val="center"/>
+            <w:shd w:fill="FAFBFC"/>
+          </w:tcPr>
+          <w:p>
+            <w:pPr>
+              <w:spacing w:before="0" w:after="0" w:line="240" w:lineRule="auto"/>
+              <w:jc w:val="left"/>
+            </w:pPr>
+            <w:r>
+              <w:rPr>
+                <w:rFonts w:ascii="Calibri" w:hAnsi="Calibri"/>
+                <w:b w:val="0"/>
+                <w:sz w:val="14"/>
+              </w:rPr>
+              <w:t>K2 / Off / T0.7</w:t>
+            </w:r>
+          </w:p>
+        </w:tc>
+        <w:tc>
+          <w:tcPr>
+            <w:tcW w:type="dxa" w:w="800"/>
+            <w:tcMar>
+              <w:top w:w="75" w:type="dxa"/>
+              <w:start w:w="85" w:type="dxa"/>
+              <w:bottom w:w="75" w:type="dxa"/>
+              <w:end w:w="85" w:type="dxa"/>
+            </w:tcMar>
+            <w:vAlign w:val="center"/>
+            <w:shd w:fill="FAFBFC"/>
+          </w:tcPr>
+          <w:p>
+            <w:pPr>
+              <w:spacing w:before="0" w:after="0" w:line="240" w:lineRule="auto"/>
+              <w:jc w:val="center"/>
+            </w:pPr>
+            <w:r>
+              <w:rPr>
+                <w:rFonts w:ascii="Calibri" w:hAnsi="Calibri"/>
+                <w:b w:val="0"/>
+                <w:sz w:val="14"/>
+              </w:rPr>
+              <w:t>804 ms</w:t>
+            </w:r>
+          </w:p>
+        </w:tc>
+        <w:tc>
+          <w:tcPr>
+            <w:tcW w:type="dxa" w:w="800"/>
+            <w:tcMar>
+              <w:top w:w="75" w:type="dxa"/>
+              <w:start w:w="85" w:type="dxa"/>
+              <w:bottom w:w="75" w:type="dxa"/>
+              <w:end w:w="85" w:type="dxa"/>
+            </w:tcMar>
+            <w:vAlign w:val="center"/>
+            <w:shd w:fill="FAFBFC"/>
+          </w:tcPr>
+          <w:p>
+            <w:pPr>
+              <w:spacing w:before="0" w:after="0" w:line="240" w:lineRule="auto"/>
+              <w:jc w:val="center"/>
+            </w:pPr>
+            <w:r>
+              <w:rPr>
+                <w:rFonts w:ascii="Calibri" w:hAnsi="Calibri"/>
+                <w:b w:val="0"/>
+                <w:sz w:val="14"/>
+              </w:rPr>
+              <w:t>1,712 ms</w:t>
+            </w:r>
+          </w:p>
+        </w:tc>
+        <w:tc>
+          <w:tcPr>
+            <w:tcW w:type="dxa" w:w="950"/>
+            <w:tcMar>
+              <w:top w:w="75" w:type="dxa"/>
+              <w:start w:w="85" w:type="dxa"/>
+              <w:bottom w:w="75" w:type="dxa"/>
+              <w:end w:w="85" w:type="dxa"/>
+            </w:tcMar>
+            <w:vAlign w:val="center"/>
+            <w:shd w:fill="FAFBFC"/>
+          </w:tcPr>
+          <w:p>
+            <w:pPr>
+              <w:spacing w:before="0" w:after="0" w:line="240" w:lineRule="auto"/>
+              <w:jc w:val="center"/>
+            </w:pPr>
+            <w:r>
+              <w:rPr>
+                <w:rFonts w:ascii="Calibri" w:hAnsi="Calibri"/>
+                <w:b w:val="0"/>
+                <w:sz w:val="14"/>
+              </w:rPr>
+              <w:t>90.2%</w:t>
+            </w:r>
+          </w:p>
+        </w:tc>
+        <w:tc>
+          <w:tcPr>
+            <w:tcW w:type="dxa" w:w="1050"/>
+            <w:tcMar>
+              <w:top w:w="75" w:type="dxa"/>
+              <w:start w:w="85" w:type="dxa"/>
+              <w:bottom w:w="75" w:type="dxa"/>
+              <w:end w:w="85" w:type="dxa"/>
+            </w:tcMar>
+            <w:vAlign w:val="center"/>
+            <w:shd w:fill="FAFBFC"/>
+          </w:tcPr>
+          <w:p>
+            <w:pPr>
+              <w:spacing w:before="0" w:after="0" w:line="240" w:lineRule="auto"/>
+              <w:jc w:val="center"/>
+            </w:pPr>
+            <w:r>
+              <w:rPr>
+                <w:rFonts w:ascii="Calibri" w:hAnsi="Calibri"/>
+                <w:b w:val="0"/>
+                <w:sz w:val="14"/>
+              </w:rPr>
+              <w:t>0.927</w:t>
+            </w:r>
+          </w:p>
+        </w:tc>
+        <w:tc>
+          <w:tcPr>
+            <w:tcW w:type="dxa" w:w="1050"/>
+            <w:tcMar>
+              <w:top w:w="75" w:type="dxa"/>
+              <w:start w:w="85" w:type="dxa"/>
+              <w:bottom w:w="75" w:type="dxa"/>
+              <w:end w:w="85" w:type="dxa"/>
+            </w:tcMar>
+            <w:vAlign w:val="center"/>
+            <w:shd w:fill="FAFBFC"/>
+          </w:tcPr>
+          <w:p>
+            <w:pPr>
+              <w:spacing w:before="0" w:after="0" w:line="240" w:lineRule="auto"/>
+              <w:jc w:val="center"/>
+            </w:pPr>
+            <w:r>
+              <w:rPr>
+                <w:rFonts w:ascii="Calibri" w:hAnsi="Calibri"/>
+                <w:b w:val="0"/>
+                <w:sz w:val="14"/>
+              </w:rPr>
+              <w:t>0.982</w:t>
+            </w:r>
+          </w:p>
+        </w:tc>
+        <w:tc>
+          <w:tcPr>
+            <w:tcW w:type="dxa" w:w="1610"/>
+            <w:tcMar>
+              <w:top w:w="75" w:type="dxa"/>
+              <w:start w:w="85" w:type="dxa"/>
+              <w:bottom w:w="75" w:type="dxa"/>
+              <w:end w:w="85" w:type="dxa"/>
+            </w:tcMar>
+            <w:vAlign w:val="center"/>
+            <w:shd w:fill="FAFBFC"/>
+          </w:tcPr>
+          <w:p>
+            <w:pPr>
+              <w:spacing w:before="0" w:after="0" w:line="240" w:lineRule="auto"/>
+              <w:jc w:val="center"/>
+            </w:pPr>
+            <w:r>
+              <w:rPr>
+                <w:rFonts w:ascii="Calibri" w:hAnsi="Calibri"/>
+                <w:b w:val="0"/>
+                <w:sz w:val="14"/>
+              </w:rPr>
+              <w:t>75</w:t>
+            </w:r>
+          </w:p>
+        </w:tc>
+      </w:tr>
+    </w:tbl>
+    <w:p>
+      <w:pPr>
+        <w:spacing w:before="120"/>
+      </w:pPr>
+      <w:r>
+        <w:t>All runs returned HTTP 200 for 47/47 cases, achieved 100% English response-language compliance and 100% refusal/prompt-injection compliance, and remained below the 10-second P90 requirement. All quality metrics were produced by the configured LLM Judges with no Judge errors.</w:t>
+      </w:r>
+    </w:p>
+    <w:p>
+      <w:pPr>
+        <w:pStyle w:val="Heading2"/>
+      </w:pPr>
+      <w:r>
+        <w:t>8.1 Retrieval depth</w:t>
+      </w:r>
+    </w:p>
+    <w:p>
+      <w:r>
+        <w:t>Top-K=1 removed too much supporting evidence: Accuracy fell 4.8 percentage points and Faithfulness fell 0.090 versus E0. Top-K=4 achieved the highest Accuracy (92.7%) and slightly higher Faithfulness (0.988), but returned 123 rather than 75 chunks and reduced Context Precision to 0.913, indicating a larger prompt and higher expected token cost.</w:t>
+      </w:r>
+    </w:p>
+    <w:p>
+      <w:pPr>
+        <w:pStyle w:val="Heading2"/>
+      </w:pPr>
+      <w:r>
+        <w:t>8.2 Reranker</w:t>
+      </w:r>
+    </w:p>
+    <w:p>
+      <w:r>
+        <w:t>The LLM reranker produced the best Context Precision (0.963), while Accuracy remained 90.2%. Its additional model call increased P50 from 779 ms to 1,608 ms and P90 from 1,479 ms to 3,860 ms. It is therefore better suited to a precision-first tier or difficult queries than to the default latency-sensitive path.</w:t>
+      </w:r>
+    </w:p>
+    <w:p>
+      <w:pPr>
+        <w:pStyle w:val="Heading2"/>
+      </w:pPr>
+      <w:r>
+        <w:t>8.3 Temperature</w:t>
+      </w:r>
+    </w:p>
+    <w:p>
+      <w:r>
+        <w:t>The three tested temperatures were 0.0, 0.2, and 0.7. Temperature did not change retrieval metrics. Temperature 0.0 preserved Accuracy, stayed close to baseline latency, and achieved the strongest observed Faithfulness (1.000); temperature 0.7 preserved Accuracy but reduced Faithfulness to 0.982.</w:t>
+      </w:r>
+    </w:p>
+    <w:tbl>
+      <w:tblPr>
+        <w:tblW w:type="dxa" w:w="9360"/>
+        <w:jc w:val="left"/>
+        <w:tblLayout w:type="fixed"/>
+        <w:tblLook w:firstColumn="1" w:firstRow="1" w:lastColumn="0" w:lastRow="0" w:noHBand="0" w:noVBand="1" w:val="04A0"/>
+        <w:tblInd w:w="120" w:type="dxa"/>
+        <w:tblBorders>
+          <w:top w:val="single" w:sz="2" w:space="0" w:color="E8F5E9"/>
+          <w:left w:val="single" w:sz="2" w:space="0" w:color="E8F5E9"/>
+          <w:bottom w:val="single" w:sz="2" w:space="0" w:color="E8F5E9"/>
+          <w:right w:val="single" w:sz="2" w:space="0" w:color="E8F5E9"/>
+          <w:insideH w:val="single" w:sz="2" w:space="0" w:color="E8F5E9"/>
+          <w:insideV w:val="single" w:sz="2" w:space="0" w:color="E8F5E9"/>
+        </w:tblBorders>
+      </w:tblPr>
+      <w:tblGrid>
+        <w:gridCol w:w="9360"/>
+      </w:tblGrid>
+      <w:tr>
+        <w:tc>
+          <w:tcPr>
+            <w:tcW w:type="dxa" w:w="9360"/>
+            <w:shd w:fill="EAF3F8"/>
+            <w:tcMar>
+              <w:top w:w="120" w:type="dxa"/>
+              <w:start w:w="160" w:type="dxa"/>
+              <w:bottom w:w="120" w:type="dxa"/>
+              <w:end w:w="160" w:type="dxa"/>
+            </w:tcMar>
+            <w:vAlign w:val="center"/>
+          </w:tcPr>
+          <w:p>
+            <w:r>
+              <w:rPr>
+                <w:rFonts w:ascii="Calibri" w:hAnsi="Calibri"/>
+                <w:b/>
+                <w:sz w:val="20"/>
+              </w:rPr>
+              <w:t xml:space="preserve">Recommended balanced default  </w:t>
+            </w:r>
+            <w:r>
+              <w:rPr>
+                <w:rFonts w:ascii="Calibri" w:hAnsi="Calibri"/>
+                <w:sz w:val="20"/>
+              </w:rPr>
+              <w:t>Top-K=2, reranker OFF, temperature=0.0. Use Top-K=4 when recall is the priority; enable the reranker selectively when retrieval precision justifies the added latency and cost.</w:t>
+            </w:r>
+          </w:p>
+        </w:tc>
+      </w:tr>
+    </w:tbl>
+    <w:p>
+      <w:pPr>
+        <w:spacing w:before="120"/>
+      </w:pPr>
+      <w:r>
+        <w:rPr>
+          <w:i/>
+        </w:rPr>
+        <w:t>Interpretation caveat: each configuration was run once. The directional differences are useful for configuration selection, but repeated runs are required before treating small score or latency differences as statistically stable.</w:t>
+      </w:r>
+    </w:p>
+    <w:p>
+      <w:pPr>
+        <w:pStyle w:val="Heading1"/>
         <w:keepNext/>
       </w:pPr>
       <w:r>
         <w:rPr>
           <w:rFonts w:ascii="Calibri" w:hAnsi="Calibri"/>
-          <w:b/>
-          <w:i w:val="0"/>
-          <w:color w:val="2E74B5"/>
-          <w:sz w:val="32"/>
         </w:rPr>
-        <w:t>8. Limitations and Next Evaluation</w:t>
+        <w:t>9. Limitations and Next Evaluation</w:t>
       </w:r>
     </w:p>
     <w:tbl>
@@ -3945,31 +5584,15 @@
         </w:tc>
       </w:tr>
       <w:tr>
-        <w:trPr>
-          <w:cantSplit w:val="true"/>
-        </w:trPr>
         <w:tc>
           <w:tcPr>
             <w:tcW w:type="dxa" w:w="2100"/>
-            <w:tcMar>
-              <w:top w:w="80" w:type="dxa"/>
-              <w:start w:w="120" w:type="dxa"/>
-              <w:bottom w:w="80" w:type="dxa"/>
-              <w:end w:w="120" w:type="dxa"/>
-            </w:tcMar>
-            <w:vAlign w:val="center"/>
           </w:tcPr>
           <w:p>
-            <w:pPr>
-              <w:spacing w:before="0" w:after="0" w:line="259" w:lineRule="auto"/>
-              <w:jc w:val="left"/>
-            </w:pPr>
             <w:r>
               <w:rPr>
                 <w:rFonts w:ascii="Calibri" w:hAnsi="Calibri"/>
                 <w:b w:val="0"/>
-                <w:i w:val="0"/>
-                <w:color w:val="172B3A"/>
                 <w:sz w:val="18"/>
               </w:rPr>
               <w:t>LLM Judge reliability</w:t>
@@ -3979,25 +5602,12 @@
         <w:tc>
           <w:tcPr>
             <w:tcW w:type="dxa" w:w="3600"/>
-            <w:tcMar>
-              <w:top w:w="80" w:type="dxa"/>
-              <w:start w:w="120" w:type="dxa"/>
-              <w:bottom w:w="80" w:type="dxa"/>
-              <w:end w:w="120" w:type="dxa"/>
-            </w:tcMar>
-            <w:vAlign w:val="center"/>
           </w:tcPr>
           <w:p>
-            <w:pPr>
-              <w:spacing w:before="0" w:after="0" w:line="259" w:lineRule="auto"/>
-              <w:jc w:val="left"/>
-            </w:pPr>
             <w:r>
               <w:rPr>
                 <w:rFonts w:ascii="Calibri" w:hAnsi="Calibri"/>
                 <w:b w:val="0"/>
-                <w:i w:val="0"/>
-                <w:color w:val="172B3A"/>
                 <w:sz w:val="18"/>
               </w:rPr>
               <w:t>Automated labels can be conservative or inconsistent on extra but grounded detail.</w:t>
@@ -4007,25 +5617,12 @@
         <w:tc>
           <w:tcPr>
             <w:tcW w:type="dxa" w:w="3660"/>
-            <w:tcMar>
-              <w:top w:w="80" w:type="dxa"/>
-              <w:start w:w="120" w:type="dxa"/>
-              <w:bottom w:w="80" w:type="dxa"/>
-              <w:end w:w="120" w:type="dxa"/>
-            </w:tcMar>
-            <w:vAlign w:val="center"/>
           </w:tcPr>
           <w:p>
-            <w:pPr>
-              <w:spacing w:before="0" w:after="0" w:line="259" w:lineRule="auto"/>
-              <w:jc w:val="left"/>
-            </w:pPr>
             <w:r>
               <w:rPr>
                 <w:rFonts w:ascii="Calibri" w:hAnsi="Calibri"/>
                 <w:b w:val="0"/>
-                <w:i w:val="0"/>
-                <w:color w:val="172B3A"/>
                 <w:sz w:val="18"/>
               </w:rPr>
               <w:t>Manually audit all failures and a stratified sample of passes.</w:t>
@@ -4034,120 +5631,62 @@
         </w:tc>
       </w:tr>
       <w:tr>
-        <w:trPr>
-          <w:cantSplit w:val="true"/>
-        </w:trPr>
         <w:tc>
           <w:tcPr>
             <w:tcW w:type="dxa" w:w="2100"/>
-            <w:tcMar>
-              <w:top w:w="80" w:type="dxa"/>
-              <w:start w:w="120" w:type="dxa"/>
-              <w:bottom w:w="80" w:type="dxa"/>
-              <w:end w:w="120" w:type="dxa"/>
-            </w:tcMar>
-            <w:vAlign w:val="center"/>
           </w:tcPr>
           <w:p>
-            <w:pPr>
-              <w:spacing w:before="0" w:after="0" w:line="259" w:lineRule="auto"/>
-              <w:jc w:val="left"/>
-            </w:pPr>
             <w:r>
               <w:rPr>
                 <w:rFonts w:ascii="Calibri" w:hAnsi="Calibri"/>
                 <w:b w:val="0"/>
-                <w:i w:val="0"/>
-                <w:color w:val="172B3A"/>
                 <w:sz w:val="18"/>
               </w:rPr>
-              <w:t>Reranker</w:t>
+              <w:t>Single-run variance</w:t>
             </w:r>
           </w:p>
         </w:tc>
         <w:tc>
           <w:tcPr>
             <w:tcW w:type="dxa" w:w="3600"/>
-            <w:tcMar>
-              <w:top w:w="80" w:type="dxa"/>
-              <w:start w:w="120" w:type="dxa"/>
-              <w:bottom w:w="80" w:type="dxa"/>
-              <w:end w:w="120" w:type="dxa"/>
-            </w:tcMar>
-            <w:vAlign w:val="center"/>
           </w:tcPr>
           <w:p>
-            <w:pPr>
-              <w:spacing w:before="0" w:after="0" w:line="259" w:lineRule="auto"/>
-              <w:jc w:val="left"/>
-            </w:pPr>
             <w:r>
               <w:rPr>
                 <w:rFonts w:ascii="Calibri" w:hAnsi="Calibri"/>
                 <w:b w:val="0"/>
-                <w:i w:val="0"/>
-                <w:color w:val="172B3A"/>
                 <w:sz w:val="18"/>
               </w:rPr>
-              <w:t>The reported baseline predates the new LLM reranker and therefore uses reranker OFF.</w:t>
+              <w:t>Each ablation configuration was executed once; small score and latency differences may be noise.</w:t>
             </w:r>
           </w:p>
         </w:tc>
         <w:tc>
           <w:tcPr>
             <w:tcW w:type="dxa" w:w="3660"/>
-            <w:tcMar>
-              <w:top w:w="80" w:type="dxa"/>
-              <w:start w:w="120" w:type="dxa"/>
-              <w:bottom w:w="80" w:type="dxa"/>
-              <w:end w:w="120" w:type="dxa"/>
-            </w:tcMar>
-            <w:vAlign w:val="center"/>
           </w:tcPr>
           <w:p>
-            <w:pPr>
-              <w:spacing w:before="0" w:after="0" w:line="259" w:lineRule="auto"/>
-              <w:jc w:val="left"/>
-            </w:pPr>
             <w:r>
               <w:rPr>
                 <w:rFonts w:ascii="Calibri" w:hAnsi="Calibri"/>
                 <w:b w:val="0"/>
-                <w:i w:val="0"/>
-                <w:color w:val="172B3A"/>
                 <w:sz w:val="18"/>
               </w:rPr>
-              <w:t>Repeat the same 47 cases with RAG_RERANKER_ENABLED=true.</w:t>
+              <w:t>Repeat each configuration and report mean, spread, and confidence intervals.</w:t>
             </w:r>
           </w:p>
         </w:tc>
       </w:tr>
       <w:tr>
-        <w:trPr>
-          <w:cantSplit w:val="true"/>
-        </w:trPr>
         <w:tc>
           <w:tcPr>
             <w:tcW w:type="dxa" w:w="2100"/>
-            <w:tcMar>
-              <w:top w:w="80" w:type="dxa"/>
-              <w:start w:w="120" w:type="dxa"/>
-              <w:bottom w:w="80" w:type="dxa"/>
-              <w:end w:w="120" w:type="dxa"/>
-            </w:tcMar>
-            <w:vAlign w:val="center"/>
           </w:tcPr>
           <w:p>
-            <w:pPr>
-              <w:spacing w:before="0" w:after="0" w:line="259" w:lineRule="auto"/>
-              <w:jc w:val="left"/>
-            </w:pPr>
             <w:r>
               <w:rPr>
                 <w:rFonts w:ascii="Calibri" w:hAnsi="Calibri"/>
                 <w:b w:val="0"/>
-                <w:i w:val="0"/>
-                <w:color w:val="172B3A"/>
                 <w:sz w:val="18"/>
               </w:rPr>
               <w:t>Cost</w:t>
@@ -4157,145 +5696,30 @@
         <w:tc>
           <w:tcPr>
             <w:tcW w:type="dxa" w:w="3600"/>
-            <w:tcMar>
-              <w:top w:w="80" w:type="dxa"/>
-              <w:start w:w="120" w:type="dxa"/>
-              <w:bottom w:w="80" w:type="dxa"/>
-              <w:end w:w="120" w:type="dxa"/>
-            </w:tcMar>
-            <w:vAlign w:val="center"/>
           </w:tcPr>
           <w:p>
-            <w:pPr>
-              <w:spacing w:before="0" w:after="0" w:line="259" w:lineRule="auto"/>
-              <w:jc w:val="left"/>
-            </w:pPr>
             <w:r>
               <w:rPr>
                 <w:rFonts w:ascii="Calibri" w:hAnsi="Calibri"/>
                 <w:b w:val="0"/>
-                <w:i w:val="0"/>
-                <w:color w:val="172B3A"/>
                 <w:sz w:val="18"/>
               </w:rPr>
-              <w:t>Token usage and cost per 1,000 calls are not yet reported.</w:t>
+              <w:t>Provider token usage and cost per 1,000 production calls are not yet reported.</w:t>
             </w:r>
           </w:p>
         </w:tc>
         <w:tc>
           <w:tcPr>
             <w:tcW w:type="dxa" w:w="3660"/>
-            <w:tcMar>
-              <w:top w:w="80" w:type="dxa"/>
-              <w:start w:w="120" w:type="dxa"/>
-              <w:bottom w:w="80" w:type="dxa"/>
-              <w:end w:w="120" w:type="dxa"/>
-            </w:tcMar>
-            <w:vAlign w:val="center"/>
           </w:tcPr>
           <w:p>
-            <w:pPr>
-              <w:spacing w:before="0" w:after="0" w:line="259" w:lineRule="auto"/>
-              <w:jc w:val="left"/>
-            </w:pPr>
             <w:r>
               <w:rPr>
                 <w:rFonts w:ascii="Calibri" w:hAnsi="Calibri"/>
                 <w:b w:val="0"/>
-                <w:i w:val="0"/>
-                <w:color w:val="172B3A"/>
                 <w:sz w:val="18"/>
               </w:rPr>
-              <w:t>Capture provider usage for generation, reranking, and judging; apply published pricing.</w:t>
-            </w:r>
-          </w:p>
-        </w:tc>
-      </w:tr>
-      <w:tr>
-        <w:trPr>
-          <w:cantSplit w:val="true"/>
-        </w:trPr>
-        <w:tc>
-          <w:tcPr>
-            <w:tcW w:type="dxa" w:w="2100"/>
-            <w:tcMar>
-              <w:top w:w="80" w:type="dxa"/>
-              <w:start w:w="120" w:type="dxa"/>
-              <w:bottom w:w="80" w:type="dxa"/>
-              <w:end w:w="120" w:type="dxa"/>
-            </w:tcMar>
-            <w:vAlign w:val="center"/>
-          </w:tcPr>
-          <w:p>
-            <w:pPr>
-              <w:spacing w:before="0" w:after="0" w:line="259" w:lineRule="auto"/>
-              <w:jc w:val="left"/>
-            </w:pPr>
-            <w:r>
-              <w:rPr>
-                <w:rFonts w:ascii="Calibri" w:hAnsi="Calibri"/>
-                <w:b w:val="0"/>
-                <w:i w:val="0"/>
-                <w:color w:val="172B3A"/>
-                <w:sz w:val="18"/>
-              </w:rPr>
-              <w:t>Sensitivity</w:t>
-            </w:r>
-          </w:p>
-        </w:tc>
-        <w:tc>
-          <w:tcPr>
-            <w:tcW w:type="dxa" w:w="3600"/>
-            <w:tcMar>
-              <w:top w:w="80" w:type="dxa"/>
-              <w:start w:w="120" w:type="dxa"/>
-              <w:bottom w:w="80" w:type="dxa"/>
-              <w:end w:w="120" w:type="dxa"/>
-            </w:tcMar>
-            <w:vAlign w:val="center"/>
-          </w:tcPr>
-          <w:p>
-            <w:pPr>
-              <w:spacing w:before="0" w:after="0" w:line="259" w:lineRule="auto"/>
-              <w:jc w:val="left"/>
-            </w:pPr>
-            <w:r>
-              <w:rPr>
-                <w:rFonts w:ascii="Calibri" w:hAnsi="Calibri"/>
-                <w:b w:val="0"/>
-                <w:i w:val="0"/>
-                <w:color w:val="172B3A"/>
-                <w:sz w:val="18"/>
-              </w:rPr>
-              <w:t>Only Top-K=2 and temperature=0.2 are represented in this report.</w:t>
-            </w:r>
-          </w:p>
-        </w:tc>
-        <w:tc>
-          <w:tcPr>
-            <w:tcW w:type="dxa" w:w="3660"/>
-            <w:tcMar>
-              <w:top w:w="80" w:type="dxa"/>
-              <w:start w:w="120" w:type="dxa"/>
-              <w:bottom w:w="80" w:type="dxa"/>
-              <w:end w:w="120" w:type="dxa"/>
-            </w:tcMar>
-            <w:vAlign w:val="center"/>
-          </w:tcPr>
-          <w:p>
-            <w:pPr>
-              <w:spacing w:before="0" w:after="0" w:line="259" w:lineRule="auto"/>
-              <w:jc w:val="left"/>
-            </w:pPr>
-            <w:r>
-              <w:rPr>
-                <w:rFonts w:ascii="Calibri" w:hAnsi="Calibri"/>
-                <w:b w:val="0"/>
-                <w:i w:val="0"/>
-                <w:color w:val="172B3A"/>
-                <w:sz w:val="18"/>
-              </w:rPr>
-              <w:t>Run controlled top_k, reranker on/off, and ≥3 temperature settings.</w:t>
+              <w:t>Capture generation, query-embedding, and optional reranker usage; exclude offline Judge calls.</w:t>
             </w:r>
           </w:p>
         </w:tc>

</xml_diff>